<commit_message>
Actualiza el manual del panel con la captura y el texto del login por DNI
La captura del Paso 1 (inicio de sesion) todavia mostraba el campo "Correo"
del formulario viejo -- quedo desactualizada con el cambio a login por DNI.
Se retomo una captura real de la pantalla de login actual y se ajusto el
texto de la portada y del Paso 1 que tambien decia "correo y contraseña".

Co-Authored-By: Claude Sonnet 5 <noreply@anthropic.com>
</commit_message>
<xml_diff>
--- a/JusticiaOrienta_06_Manual_Panel_Administracion.docx
+++ b/JusticiaOrienta_06_Manual_Panel_Administracion.docx
@@ -160,7 +160,7 @@
               <w:rPr>
                 <w:sz w:val="21"/>
               </w:rPr>
-              <w:t>Tu correo y contraseña — pídeselos a quien administre el sistema en tu Corte</w:t>
+              <w:t>Tu DNI y contraseña — pídeselos a quien administre el sistema en tu Corte</w:t>
             </w:r>
           </w:p>
         </w:tc>
@@ -391,7 +391,7 @@
           <w:color w:val="222222"/>
           <w:sz w:val="22"/>
         </w:rPr>
-        <w:t>Abre la dirección del panel en tu navegador y escribe tu correo y contraseña.</w:t>
+        <w:t>Abre la dirección del panel en tu navegador y escribe tu DNI (8 dígitos) y tu contraseña.</w:t>
       </w:r>
     </w:p>
     <w:p>

</xml_diff>